<commit_message>
Final diploma project updates
</commit_message>
<xml_diff>
--- a/Задача.docx
+++ b/Задача.docx
@@ -71,19 +71,7 @@
         <w:rPr>
           <w:szCs w:val="28"/>
         </w:rPr>
-        <w:t>Заведующ</w:t>
-      </w:r>
-      <w:r>
-        <w:rPr>
-          <w:szCs w:val="28"/>
-        </w:rPr>
-        <w:t>ая</w:t>
-      </w:r>
-      <w:r>
-        <w:rPr>
-          <w:szCs w:val="28"/>
-        </w:rPr>
-        <w:t xml:space="preserve"> кафедры «Информатики и вычислительной техники» </w:t>
+        <w:t xml:space="preserve">Заведующая кафедры «Информатики и вычислительной техники» </w:t>
       </w:r>
     </w:p>
     <w:p>
@@ -136,7 +124,19 @@
           <w:szCs w:val="28"/>
         </w:rPr>
         <w:tab/>
-        <w:t>2026 г.</w:t>
+        <w:t>202</w:t>
+      </w:r>
+      <w:r>
+        <w:rPr>
+          <w:szCs w:val="28"/>
+        </w:rPr>
+        <w:t>5</w:t>
+      </w:r>
+      <w:r>
+        <w:rPr>
+          <w:szCs w:val="28"/>
+        </w:rPr>
+        <w:t xml:space="preserve"> г.</w:t>
       </w:r>
     </w:p>
     <w:p>
@@ -183,10 +183,7 @@
       </w:r>
       <w:bookmarkEnd w:id="0"/>
       <w:r>
-        <w:t xml:space="preserve"> ИСп319ДК</w:t>
-      </w:r>
-      <w:r>
-        <w:t xml:space="preserve"> Федин А.А.</w:t>
+        <w:t xml:space="preserve"> ИСп319ДК Федин А.А.</w:t>
       </w:r>
     </w:p>
     <w:p>
@@ -220,21 +217,63 @@
         <w:rPr>
           <w:szCs w:val="20"/>
         </w:rPr>
-        <w:t>утверждена приказом по колледжу № ______ от ________________________</w:t>
-      </w:r>
-    </w:p>
-    <w:p>
-      <w:pPr>
-        <w:spacing w:line="360" w:lineRule="auto"/>
-        <w:rPr>
-          <w:szCs w:val="20"/>
-        </w:rPr>
-      </w:pPr>
-      <w:r>
-        <w:rPr>
-          <w:szCs w:val="20"/>
-        </w:rPr>
-        <w:t>Сроки сдачи студентом законченной работы «___» _____________ 2026 год</w:t>
+        <w:t xml:space="preserve">утверждена приказом по колледжу № </w:t>
+      </w:r>
+      <w:r>
+        <w:rPr>
+          <w:szCs w:val="20"/>
+        </w:rPr>
+        <w:t>1472/о</w:t>
+      </w:r>
+      <w:r>
+        <w:rPr>
+          <w:szCs w:val="20"/>
+        </w:rPr>
+        <w:t xml:space="preserve"> от</w:t>
+      </w:r>
+      <w:r>
+        <w:rPr>
+          <w:szCs w:val="20"/>
+        </w:rPr>
+        <w:t xml:space="preserve"> 15.12.2025</w:t>
+      </w:r>
+    </w:p>
+    <w:p>
+      <w:pPr>
+        <w:spacing w:line="360" w:lineRule="auto"/>
+        <w:rPr>
+          <w:szCs w:val="20"/>
+        </w:rPr>
+      </w:pPr>
+      <w:r>
+        <w:rPr>
+          <w:szCs w:val="20"/>
+        </w:rPr>
+        <w:t>Сроки сдачи студентом законченной работы «</w:t>
+      </w:r>
+      <w:r>
+        <w:rPr>
+          <w:szCs w:val="20"/>
+        </w:rPr>
+        <w:t>10</w:t>
+      </w:r>
+      <w:r>
+        <w:rPr>
+          <w:szCs w:val="20"/>
+        </w:rPr>
+        <w:t>»</w:t>
+      </w:r>
+      <w:r>
+        <w:rPr>
+          <w:szCs w:val="20"/>
+        </w:rPr>
+        <w:t xml:space="preserve"> июня</w:t>
+      </w:r>
+      <w:r>
+        <w:rPr>
+          <w:szCs w:val="20"/>
+        </w:rPr>
+        <w:t xml:space="preserve"> 2026 год</w:t>
       </w:r>
     </w:p>
     <w:p>
@@ -439,13 +478,7 @@
         <w:rPr>
           <w:szCs w:val="28"/>
         </w:rPr>
-        <w:t>Рассмотреть технику безопасности при работе на ПК</w:t>
-      </w:r>
-      <w:r>
-        <w:rPr>
-          <w:szCs w:val="28"/>
-        </w:rPr>
-        <w:t xml:space="preserve"> и </w:t>
+        <w:t xml:space="preserve">Рассмотреть технику безопасности при работе на ПК и </w:t>
       </w:r>
       <w:r>
         <w:rPr>
@@ -477,7 +510,14 @@
         <w:t>ПРИЛОЖЕНИЕ А</w:t>
       </w:r>
     </w:p>
-    <w:p/>
+    <w:p>
+      <w:pPr>
+        <w:spacing w:line="360" w:lineRule="auto"/>
+      </w:pPr>
+      <w:r>
+        <w:t>ПРИЛОЖЕНИЕ Б</w:t>
+      </w:r>
+    </w:p>
     <w:sectPr>
       <w:pgSz w:w="11906" w:h="16838"/>
       <w:pgMar w:top="1134" w:right="850" w:bottom="1134" w:left="1701" w:header="708" w:footer="708" w:gutter="0"/>

</xml_diff>